<commit_message>
Add manual testing, penetration testing and security to resume
Adds Testing & QA and Security skill rows, QA/VAPT bullets under both
roles, a penetration-testing achievement, and a summary mention. Updates
the DOCX, regenerated PDF (still 2 pages), and the web page.

Co-Authored-By: Claude Opus 5.5 (1M context) <noreply@anthropic.com>
</commit_message>
<xml_diff>
--- a/Prasad_Yegireddi_Resume.docx
+++ b/Prasad_Yegireddi_Resume.docx
@@ -4,7 +4,7 @@
   <w:body>
     <w:p>
       <w:pPr>
-        <w:spacing w:after="60"/>
+        <w:spacing w:after="36"/>
         <w:jc w:val="center"/>
       </w:pPr>
       <w:r>
@@ -20,7 +20,7 @@
     </w:p>
     <w:p>
       <w:pPr>
-        <w:spacing w:after="80"/>
+        <w:spacing w:after="48"/>
         <w:jc w:val="center"/>
       </w:pPr>
       <w:r>
@@ -95,7 +95,7 @@
     </w:p>
     <w:p>
       <w:pPr>
-        <w:spacing w:after="160"/>
+        <w:spacing w:after="96"/>
         <w:jc w:val="center"/>
       </w:pPr>
       <w:r>
@@ -146,7 +146,7 @@
         <w:pBdr>
           <w:bottom w:val="single" w:sz="4" w:space="4" w:color="EFF6FF"/>
         </w:pBdr>
-        <w:spacing w:before="240" w:after="100"/>
+        <w:spacing w:before="144" w:after="60"/>
       </w:pPr>
       <w:r>
         <w:rPr>
@@ -164,11 +164,11 @@
         <w:pBdr>
           <w:left w:val="single" w:sz="12" w:space="8" w:color="1D4ED8"/>
         </w:pBdr>
-        <w:spacing w:before="80" w:after="160"/>
+        <w:spacing w:before="48" w:after="96"/>
         <w:ind w:left="160"/>
       </w:pPr>
       <w:r>
-        <w:t xml:space="preserve">Frappe / ERPNext backend engineer with 7 years of Python experience building enterprise platforms — multi-tenant Frappe hosting, payment-gateway and biometric-hardware integrations, and government attendance systems serving ~1 lakh employees. Featured speaker on the official Frappe Built Talks series. Currently leading a team of 10 engineers at caratRED Technologies.</w:t>
+        <w:t>Frappe / ERPNext backend engineer with 7 years of Python experience building enterprise platforms — multi-tenant Frappe hosting, payment-gateway and biometric-hardware integrations, and government attendance systems serving ~1 lakh employees. Hands-on in manual testing, penetration testing (VAPT), and application security, with a focus on shipping secure, well-tested releases. Featured speaker on the official Frappe Built Talks series. Currently leading a team of 10 engineers at caratRED Technologies.</w:t>
       </w:r>
     </w:p>
     <w:p>
@@ -177,7 +177,7 @@
         <w:pBdr>
           <w:bottom w:val="single" w:sz="4" w:space="4" w:color="EFF6FF"/>
         </w:pBdr>
-        <w:spacing w:before="240" w:after="100"/>
+        <w:spacing w:before="144" w:after="60"/>
       </w:pPr>
       <w:r>
         <w:rPr>
@@ -193,7 +193,7 @@
     <w:p>
       <w:pPr>
         <w:keepNext/>
-        <w:spacing w:before="120" w:after="20"/>
+        <w:spacing w:before="72" w:after="20"/>
       </w:pPr>
       <w:r>
         <w:rPr>
@@ -223,7 +223,7 @@
     <w:p>
       <w:pPr>
         <w:keepNext/>
-        <w:spacing w:after="60"/>
+        <w:spacing w:after="36"/>
       </w:pPr>
       <w:r>
         <w:rPr>
@@ -338,52 +338,6 @@
     </w:p>
     <w:p>
       <w:pPr>
-        <w:keepNext/>
-        <w:spacing w:before="120" w:after="20"/>
-      </w:pPr>
-      <w:r>
-        <w:rPr>
-          <w:b/>
-          <w:bCs/>
-          <w:color w:val="0F172A"/>
-          <w:sz w:val="26"/>
-          <w:szCs w:val="26"/>
-        </w:rPr>
-        <w:t xml:space="preserve">Software Engineer</w:t>
-      </w:r>
-      <w:r>
-        <w:rPr>
-          <w:color w:val="64748B"/>
-        </w:rPr>
-        <w:t xml:space="preserve">  ·  </w:t>
-      </w:r>
-      <w:r>
-        <w:rPr>
-          <w:b/>
-          <w:bCs/>
-          <w:color w:val="1D4ED8"/>
-        </w:rPr>
-        <w:t xml:space="preserve">RNIT Software &amp; Solutions</w:t>
-      </w:r>
-    </w:p>
-    <w:p>
-      <w:pPr>
-        <w:keepNext/>
-        <w:spacing w:after="60"/>
-      </w:pPr>
-      <w:r>
-        <w:rPr>
-          <w:i/>
-          <w:iCs/>
-          <w:color w:val="64748B"/>
-          <w:sz w:val="20"/>
-          <w:szCs w:val="20"/>
-        </w:rPr>
-        <w:t xml:space="preserve">November 2019 – July 2024  ·  4 yrs 9 mos</w:t>
-      </w:r>
-    </w:p>
-    <w:p>
-      <w:pPr>
         <w:pStyle w:val="ListParagraph"/>
         <w:numPr>
           <w:ilvl w:val="0"/>
@@ -392,18 +346,64 @@
         <w:spacing w:after="40"/>
       </w:pPr>
       <w:r>
-        <w:t xml:space="preserve">Built and customized </w:t>
-      </w:r>
-      <w:r>
-        <w:rPr>
-          <w:b/>
-          <w:bCs/>
-          <w:color w:val="0F172A"/>
-        </w:rPr>
-        <w:t xml:space="preserve">ERPNext modules</w:t>
-      </w:r>
-      <w:r>
-        <w:t xml:space="preserve"> across HR, CRM, Accounts, Buying &amp; Selling for diverse enterprise clients.</w:t>
+        <w:t xml:space="preserve">Own </w:t>
+      </w:r>
+      <w:r>
+        <w:rPr>
+          <w:b/>
+          <w:bCs/>
+          <w:color w:val="0F172A"/>
+        </w:rPr>
+        <w:t>QA and security sign-off</w:t>
+      </w:r>
+      <w:r>
+        <w:t xml:space="preserve"> for releases: manual functional, regression, and UAT testing, plus penetration testing of Frappe apps and APIs against the OWASP Top 10 before production.</w:t>
+      </w:r>
+    </w:p>
+    <w:p>
+      <w:pPr>
+        <w:keepNext/>
+        <w:spacing w:before="72" w:after="20"/>
+      </w:pPr>
+      <w:r>
+        <w:rPr>
+          <w:b/>
+          <w:bCs/>
+          <w:color w:val="0F172A"/>
+          <w:sz w:val="26"/>
+          <w:szCs w:val="26"/>
+        </w:rPr>
+        <w:t xml:space="preserve">Software Engineer</w:t>
+      </w:r>
+      <w:r>
+        <w:rPr>
+          <w:color w:val="64748B"/>
+        </w:rPr>
+        <w:t xml:space="preserve">  ·  </w:t>
+      </w:r>
+      <w:r>
+        <w:rPr>
+          <w:b/>
+          <w:bCs/>
+          <w:color w:val="1D4ED8"/>
+        </w:rPr>
+        <w:t xml:space="preserve">RNIT Software &amp; Solutions</w:t>
+      </w:r>
+    </w:p>
+    <w:p>
+      <w:pPr>
+        <w:keepNext/>
+        <w:spacing w:after="36"/>
+      </w:pPr>
+      <w:r>
+        <w:rPr>
+          <w:i/>
+          <w:iCs/>
+          <w:color w:val="64748B"/>
+          <w:sz w:val="20"/>
+          <w:szCs w:val="20"/>
+        </w:rPr>
+        <w:t xml:space="preserve">November 2019 – July 2024  ·  4 yrs 9 mos</w:t>
       </w:r>
     </w:p>
     <w:p>
@@ -416,7 +416,18 @@
         <w:spacing w:after="40"/>
       </w:pPr>
       <w:r>
-        <w:t xml:space="preserve">Integrated biometric attendance hardware with ERPNext, eliminating manual punch-in processes.</w:t>
+        <w:t xml:space="preserve">Built and customized </w:t>
+      </w:r>
+      <w:r>
+        <w:rPr>
+          <w:b/>
+          <w:bCs/>
+          <w:color w:val="0F172A"/>
+        </w:rPr>
+        <w:t xml:space="preserve">ERPNext modules</w:t>
+      </w:r>
+      <w:r>
+        <w:t xml:space="preserve"> across HR, CRM, Accounts, Buying &amp; Selling for diverse enterprise clients.</w:t>
       </w:r>
     </w:p>
     <w:p>
@@ -429,7 +440,7 @@
         <w:spacing w:after="40"/>
       </w:pPr>
       <w:r>
-        <w:t xml:space="preserve">Developed facial recognition attendance and monitoring systems (Python, Angular) deployed for the Telangana and Andhra Pradesh state governments.</w:t>
+        <w:t xml:space="preserve">Integrated biometric attendance hardware with ERPNext, eliminating manual punch-in processes.</w:t>
       </w:r>
     </w:p>
     <w:p>
@@ -442,7 +453,7 @@
         <w:spacing w:after="40"/>
       </w:pPr>
       <w:r>
-        <w:t xml:space="preserve">Managed AWS EC2 deployments, Docker containerization, server hardening, and REST API integrations with third-party platforms.</w:t>
+        <w:t xml:space="preserve">Developed facial recognition attendance and monitoring systems (Python, Angular) deployed for the Telangana and Andhra Pradesh state governments.</w:t>
       </w:r>
     </w:p>
     <w:p>
@@ -455,6 +466,43 @@
         <w:spacing w:after="40"/>
       </w:pPr>
       <w:r>
+        <w:t xml:space="preserve">Managed AWS EC2 deployments, Docker containerization, server hardening, and REST API integrations with third-party platforms.</w:t>
+      </w:r>
+    </w:p>
+    <w:p>
+      <w:pPr>
+        <w:pStyle w:val="ListParagraph"/>
+        <w:numPr>
+          <w:ilvl w:val="0"/>
+          <w:numId w:val="2"/>
+        </w:numPr>
+        <w:spacing w:after="40"/>
+      </w:pPr>
+      <w:r>
+        <w:t xml:space="preserve">Performed </w:t>
+      </w:r>
+      <w:r>
+        <w:rPr>
+          <w:b/>
+          <w:bCs/>
+          <w:color w:val="0F172A"/>
+        </w:rPr>
+        <w:t>manual testing</w:t>
+      </w:r>
+      <w:r>
+        <w:t xml:space="preserve"> (functional, integration, regression) of ERPNext modules and REST APIs; wrote test cases and tracked defects through to closure.</w:t>
+      </w:r>
+    </w:p>
+    <w:p>
+      <w:pPr>
+        <w:pStyle w:val="ListParagraph"/>
+        <w:numPr>
+          <w:ilvl w:val="0"/>
+          <w:numId w:val="2"/>
+        </w:numPr>
+        <w:spacing w:after="40"/>
+      </w:pPr>
+      <w:r>
         <w:t xml:space="preserve">Served as primary technical contact for client communications, bug resolution, and feature planning.</w:t>
       </w:r>
     </w:p>
@@ -464,7 +512,7 @@
         <w:pBdr>
           <w:bottom w:val="single" w:sz="4" w:space="4" w:color="EFF6FF"/>
         </w:pBdr>
-        <w:spacing w:before="240" w:after="100"/>
+        <w:spacing w:before="144" w:after="60"/>
       </w:pPr>
       <w:r>
         <w:rPr>
@@ -480,7 +528,7 @@
     <w:p>
       <w:pPr>
         <w:keepNext/>
-        <w:spacing w:before="100" w:after="20"/>
+        <w:spacing w:before="60" w:after="20"/>
       </w:pPr>
       <w:r>
         <w:rPr>
@@ -508,7 +556,7 @@
     </w:p>
     <w:p>
       <w:pPr>
-        <w:spacing w:after="60"/>
+        <w:spacing w:after="36"/>
       </w:pPr>
       <w:r>
         <w:rPr>
@@ -524,7 +572,7 @@
     <w:p>
       <w:pPr>
         <w:keepNext/>
-        <w:spacing w:before="100" w:after="20"/>
+        <w:spacing w:before="60" w:after="20"/>
       </w:pPr>
       <w:r>
         <w:rPr>
@@ -552,7 +600,7 @@
     </w:p>
     <w:p>
       <w:pPr>
-        <w:spacing w:after="60"/>
+        <w:spacing w:after="36"/>
       </w:pPr>
       <w:r>
         <w:rPr>
@@ -568,7 +616,7 @@
     <w:p>
       <w:pPr>
         <w:keepNext/>
-        <w:spacing w:before="100" w:after="20"/>
+        <w:spacing w:before="60" w:after="20"/>
       </w:pPr>
       <w:r>
         <w:rPr>
@@ -596,7 +644,7 @@
     </w:p>
     <w:p>
       <w:pPr>
-        <w:spacing w:after="60"/>
+        <w:spacing w:after="36"/>
       </w:pPr>
       <w:r>
         <w:rPr>
@@ -612,7 +660,7 @@
     <w:p>
       <w:pPr>
         <w:keepNext/>
-        <w:spacing w:before="100" w:after="20"/>
+        <w:spacing w:before="60" w:after="20"/>
       </w:pPr>
       <w:r>
         <w:rPr>
@@ -640,7 +688,7 @@
     </w:p>
     <w:p>
       <w:pPr>
-        <w:spacing w:after="60"/>
+        <w:spacing w:after="36"/>
       </w:pPr>
       <w:r>
         <w:rPr>
@@ -656,7 +704,7 @@
     <w:p>
       <w:pPr>
         <w:keepNext/>
-        <w:spacing w:before="100" w:after="20"/>
+        <w:spacing w:before="60" w:after="20"/>
       </w:pPr>
       <w:r>
         <w:rPr>
@@ -684,7 +732,7 @@
     </w:p>
     <w:p>
       <w:pPr>
-        <w:spacing w:after="60"/>
+        <w:spacing w:after="36"/>
       </w:pPr>
       <w:r>
         <w:rPr>
@@ -700,7 +748,7 @@
     <w:p>
       <w:pPr>
         <w:keepNext/>
-        <w:spacing w:before="100" w:after="20"/>
+        <w:spacing w:before="60" w:after="20"/>
       </w:pPr>
       <w:r>
         <w:rPr>
@@ -728,7 +776,7 @@
     </w:p>
     <w:p>
       <w:pPr>
-        <w:spacing w:after="60"/>
+        <w:spacing w:after="36"/>
       </w:pPr>
       <w:r>
         <w:rPr>
@@ -747,7 +795,7 @@
         <w:pBdr>
           <w:bottom w:val="single" w:sz="4" w:space="4" w:color="EFF6FF"/>
         </w:pBdr>
-        <w:spacing w:before="240" w:after="100"/>
+        <w:spacing w:before="144" w:after="60"/>
       </w:pPr>
       <w:r>
         <w:rPr>
@@ -762,7 +810,7 @@
     </w:p>
     <w:p>
       <w:pPr>
-        <w:spacing w:before="60" w:after="40"/>
+        <w:spacing w:before="36" w:after="40"/>
       </w:pPr>
       <w:r>
         <w:rPr>
@@ -778,7 +826,7 @@
     </w:p>
     <w:p>
       <w:pPr>
-        <w:spacing w:before="60" w:after="40"/>
+        <w:spacing w:before="36" w:after="40"/>
       </w:pPr>
       <w:r>
         <w:rPr>
@@ -794,7 +842,7 @@
     </w:p>
     <w:p>
       <w:pPr>
-        <w:spacing w:before="60" w:after="40"/>
+        <w:spacing w:before="36" w:after="40"/>
       </w:pPr>
       <w:r>
         <w:rPr>
@@ -810,7 +858,7 @@
     </w:p>
     <w:p>
       <w:pPr>
-        <w:spacing w:before="60" w:after="40"/>
+        <w:spacing w:before="36" w:after="40"/>
       </w:pPr>
       <w:r>
         <w:rPr>
@@ -826,7 +874,7 @@
     </w:p>
     <w:p>
       <w:pPr>
-        <w:spacing w:before="60" w:after="40"/>
+        <w:spacing w:before="36" w:after="40"/>
       </w:pPr>
       <w:r>
         <w:rPr>
@@ -838,6 +886,38 @@
       </w:r>
       <w:r>
         <w:t xml:space="preserve">Claude Code · Cursor · GitHub Copilot · N8N</w:t>
+      </w:r>
+    </w:p>
+    <w:p>
+      <w:pPr>
+        <w:spacing w:before="36" w:after="40"/>
+      </w:pPr>
+      <w:r>
+        <w:rPr>
+          <w:b/>
+          <w:bCs/>
+          <w:color w:val="0F172A"/>
+        </w:rPr>
+        <w:t xml:space="preserve">Testing &amp; QA: </w:t>
+      </w:r>
+      <w:r>
+        <w:t>Manual Testing · Functional / Regression / UAT · Test Case Design · API Testing (Postman) · Bug Tracking</w:t>
+      </w:r>
+    </w:p>
+    <w:p>
+      <w:pPr>
+        <w:spacing w:before="36" w:after="40"/>
+      </w:pPr>
+      <w:r>
+        <w:rPr>
+          <w:b/>
+          <w:bCs/>
+          <w:color w:val="0F172A"/>
+        </w:rPr>
+        <w:t xml:space="preserve">Security: </w:t>
+      </w:r>
+      <w:r>
+        <w:t>Penetration Testing / VAPT · OWASP Top 10 · Burp Suite · OWASP ZAP · Nmap · Server Hardening · Secure Coding</w:t>
       </w:r>
     </w:p>
     <w:p>
@@ -846,7 +926,7 @@
         <w:pBdr>
           <w:bottom w:val="single" w:sz="4" w:space="4" w:color="EFF6FF"/>
         </w:pBdr>
-        <w:spacing w:before="240" w:after="100"/>
+        <w:spacing w:before="144" w:after="60"/>
       </w:pPr>
       <w:r>
         <w:rPr>
@@ -970,37 +1050,18 @@
         <w:spacing w:after="40"/>
       </w:pPr>
       <w:r>
-        <w:t xml:space="preserve">Integrated </w:t>
-      </w:r>
-      <w:r>
-        <w:rPr>
-          <w:b/>
-          <w:bCs/>
-          <w:color w:val="0F172A"/>
-        </w:rPr>
-        <w:t xml:space="preserve">AI-assisted coding tools</w:t>
-      </w:r>
-      <w:r>
-        <w:t xml:space="preserve"> (Claude Code, Cursor, GitHub Copilot) into team workflows, speeding up feature delivery and code review turnaround.</w:t>
-      </w:r>
-    </w:p>
-    <w:p>
-      <w:pPr>
-        <w:keepNext/>
-        <w:pBdr>
-          <w:bottom w:val="single" w:sz="4" w:space="4" w:color="EFF6FF"/>
-        </w:pBdr>
-        <w:spacing w:before="240" w:after="100"/>
-      </w:pPr>
-      <w:r>
-        <w:rPr>
-          <w:b/>
-          <w:bCs/>
-          <w:color w:val="1D4ED8"/>
-          <w:sz w:val="20"/>
-          <w:szCs w:val="20"/>
-        </w:rPr>
-        <w:t xml:space="preserve">CERTIFICATIONS</w:t>
+        <w:t xml:space="preserve">Conducted </w:t>
+      </w:r>
+      <w:r>
+        <w:rPr>
+          <w:b/>
+          <w:bCs/>
+          <w:color w:val="0F172A"/>
+        </w:rPr>
+        <w:t>penetration testing and vulnerability assessments</w:t>
+      </w:r>
+      <w:r>
+        <w:t xml:space="preserve"> on production Frappe / ERPNext apps, fixing access-control, injection, and permission issues.</w:t>
       </w:r>
     </w:p>
     <w:p>
@@ -1013,7 +1074,37 @@
         <w:spacing w:after="40"/>
       </w:pPr>
       <w:r>
-        <w:t xml:space="preserve">Managing ERPNext Custom Code via GitHub</w:t>
+        <w:t xml:space="preserve">Integrated </w:t>
+      </w:r>
+      <w:r>
+        <w:rPr>
+          <w:b/>
+          <w:bCs/>
+          <w:color w:val="0F172A"/>
+        </w:rPr>
+        <w:t xml:space="preserve">AI-assisted coding tools</w:t>
+      </w:r>
+      <w:r>
+        <w:t xml:space="preserve"> (Claude Code, Cursor, GitHub Copilot) into team workflows, speeding up feature delivery and code review turnaround.</w:t>
+      </w:r>
+    </w:p>
+    <w:p>
+      <w:pPr>
+        <w:keepNext/>
+        <w:pBdr>
+          <w:bottom w:val="single" w:sz="4" w:space="4" w:color="EFF6FF"/>
+        </w:pBdr>
+        <w:spacing w:before="144" w:after="60"/>
+      </w:pPr>
+      <w:r>
+        <w:rPr>
+          <w:b/>
+          <w:bCs/>
+          <w:color w:val="1D4ED8"/>
+          <w:sz w:val="20"/>
+          <w:szCs w:val="20"/>
+        </w:rPr>
+        <w:t xml:space="preserve">CERTIFICATIONS</w:t>
       </w:r>
     </w:p>
     <w:p>
@@ -1026,7 +1117,7 @@
         <w:spacing w:after="40"/>
       </w:pPr>
       <w:r>
-        <w:t xml:space="preserve">Secure Coding Based on OWASP Top 10</w:t>
+        <w:t xml:space="preserve">Managing ERPNext Custom Code via GitHub</w:t>
       </w:r>
     </w:p>
     <w:p>
@@ -1039,6 +1130,19 @@
         <w:spacing w:after="40"/>
       </w:pPr>
       <w:r>
+        <w:t xml:space="preserve">Secure Coding Based on OWASP Top 10</w:t>
+      </w:r>
+    </w:p>
+    <w:p>
+      <w:pPr>
+        <w:pStyle w:val="ListParagraph"/>
+        <w:numPr>
+          <w:ilvl w:val="0"/>
+          <w:numId w:val="2"/>
+        </w:numPr>
+        <w:spacing w:after="40"/>
+      </w:pPr>
+      <w:r>
         <w:t xml:space="preserve">Claude Code Beginner Crash Course</w:t>
       </w:r>
     </w:p>
@@ -1048,7 +1152,7 @@
         <w:pBdr>
           <w:bottom w:val="single" w:sz="4" w:space="4" w:color="EFF6FF"/>
         </w:pBdr>
-        <w:spacing w:before="240" w:after="100"/>
+        <w:spacing w:before="144" w:after="60"/>
       </w:pPr>
       <w:r>
         <w:rPr>
@@ -1064,7 +1168,7 @@
     <w:p>
       <w:pPr>
         <w:keepNext/>
-        <w:spacing w:before="80" w:after="20"/>
+        <w:spacing w:before="48" w:after="20"/>
       </w:pPr>
       <w:r>
         <w:rPr>
@@ -1077,7 +1181,7 @@
     </w:p>
     <w:p>
       <w:pPr>
-        <w:spacing w:after="60"/>
+        <w:spacing w:after="36"/>
       </w:pPr>
       <w:r>
         <w:rPr>
@@ -1091,7 +1195,7 @@
     <w:p>
       <w:pPr>
         <w:keepNext/>
-        <w:spacing w:before="80" w:after="20"/>
+        <w:spacing w:before="48" w:after="20"/>
       </w:pPr>
       <w:r>
         <w:rPr>
@@ -1104,7 +1208,7 @@
     </w:p>
     <w:p>
       <w:pPr>
-        <w:spacing w:after="60"/>
+        <w:spacing w:after="36"/>
       </w:pPr>
       <w:r>
         <w:rPr>
@@ -1117,7 +1221,7 @@
     </w:p>
     <w:sectPr>
       <w:pgSz w:w="12240" w:h="15840"/>
-      <w:pgMar w:top="1080" w:right="1080" w:bottom="1080" w:left="1080" w:header="708" w:footer="708" w:gutter="0"/>
+      <w:pgMar w:top="720" w:right="864" w:bottom="720" w:left="864" w:header="708" w:footer="708" w:gutter="0"/>
       <w:cols w:space="720"/>
       <w:docGrid w:linePitch="360"/>
     </w:sectPr>

</xml_diff>